<commit_message>
Update Tem coisas que a gente faz que não é por impulso.docx
</commit_message>
<xml_diff>
--- a/Caxuxa/Tem coisas que a gente faz que não é por impulso.docx
+++ b/Caxuxa/Tem coisas que a gente faz que não é por impulso.docx
@@ -29,17 +29,28 @@
       </w:r>
       <w:proofErr w:type="spellEnd"/>
       <w:r>
-        <w:t xml:space="preserve"> está quase completamente recuperada, evoluiu pro "semiaberto", está andan</w:t>
-      </w:r>
-      <w:r>
-        <w:t>d</w:t>
+        <w:t xml:space="preserve"> está quase completamente recuperada, evoluiu pro "semiaberto", está andando normalmente de novo, pulando, correndo, voando a meio metro do chão.</w:t>
+      </w:r>
+    </w:p>
+    <w:p/>
+    <w:p>
+      <w:r>
+        <w:t>“Que importa o mal que te atormenta</w:t>
+      </w:r>
+    </w:p>
+    <w:p>
+      <w:r>
+        <w:t>Se o sonho te contenta</w:t>
       </w:r>
       <w:bookmarkStart w:id="0" w:name="_GoBack"/>
       <w:bookmarkEnd w:id="0"/>
-      <w:r>
-        <w:t>o normalmente de novo, pulando, correndo, voando a meio metro do chão.</w:t>
-      </w:r>
     </w:p>
+    <w:p>
+      <w:r>
+        <w:t>E pode se realizar”</w:t>
+      </w:r>
+    </w:p>
+    <w:p/>
     <w:sectPr>
       <w:pgSz w:w="11906" w:h="16838"/>
       <w:pgMar w:top="1417" w:right="1701" w:bottom="1417" w:left="1701" w:header="708" w:footer="708" w:gutter="0"/>

</xml_diff>